<commit_message>
Refine CFD Spanish contract rules
</commit_message>
<xml_diff>
--- a/Project Rooms/Contract for Deed/output/v01 - 320 Rose - Contract for Deed Agreement - BILINGUAL SPANISH DRAFT.docx
+++ b/Project Rooms/Contract for Deed/output/v01 - 320 Rose - Contract for Deed Agreement - BILINGUAL SPANISH DRAFT.docx
@@ -527,34 +527,6 @@
     </w:p>
     <w:p>
       <w:pPr>
-        <w:pStyle w:val="SpanishTranslationDraft"/>
-        <w:ind w:left="259"/>
-      </w:pPr>
-      <w:r>
-        <w:rPr>
-          <w:rFonts w:ascii="Arial" w:hAnsi="Arial"/>
-          <w:color w:val="0066CC"/>
-          <w:sz w:val="18"/>
-        </w:rPr>
-        <w:t>English Version Controls: The Spanish-language text in this bilingual draft is provided as a draft convenience translation only. If there is any conflict between the English text and the Spanish text, the English text controls. The Spanish text is not a certified legal translation unless separately approved by Wes, counsel, or a qualified translator.</w:t>
-      </w:r>
-    </w:p>
-    <w:p>
-      <w:pPr>
-        <w:pStyle w:val="SpanishTranslationDraft"/>
-        <w:ind w:left="259"/>
-      </w:pPr>
-      <w:r>
-        <w:rPr>
-          <w:rFonts w:ascii="Arial" w:hAnsi="Arial"/>
-          <w:color w:val="0066CC"/>
-          <w:sz w:val="18"/>
-        </w:rPr>
-        <w:t>Prevalece la version en ingles: El texto en espanol de este borrador bilingue se proporciona solo como una traduccion preliminar de conveniencia. Si existe algun conflicto entre el texto en ingles y el texto en espanol, prevalece el texto en ingles. El texto en espanol no es una traduccion legal certificada salvo que sea aprobado por separado por Wes, un abogado o un traductor calificado.</w:t>
-      </w:r>
-    </w:p>
-    <w:p>
-      <w:pPr>
         <w:pStyle w:val="t1"/>
         <w:tabs>
           <w:tab w:val="left" w:pos="270"/>
@@ -883,6 +855,20 @@
           <w:u w:val="single"/>
         </w:rPr>
       </w:pPr>
+    </w:p>
+    <w:p>
+      <w:pPr>
+        <w:pStyle w:val="SpanishTranslationDraft"/>
+      </w:pPr>
+      <w:r>
+        <w:rPr>
+          <w:rFonts w:ascii="Arial" w:hAnsi="Arial"/>
+          <w:b/>
+          <w:color w:val="0066CC"/>
+          <w:sz w:val="24"/>
+        </w:rPr>
+        <w:t>Prevalece la version en ingles: El texto en espanol de este borrador bilingue se proporciona solo como una traduccion preliminar de conveniencia. Si existe algun conflicto entre el texto en ingles y el texto en espanol, prevalece el texto en ingles. El texto en espanol no es una traduccion legal certificada salvo que sea aprobado por separado por Wes, un abogado o un traductor calificado.</w:t>
+      </w:r>
     </w:p>
     <w:p>
       <w:pPr>
@@ -1903,20 +1889,6 @@
     </w:p>
     <w:p>
       <w:pPr>
-        <w:pStyle w:val="SpanishTranslationDraft"/>
-        <w:ind w:left="259"/>
-      </w:pPr>
-      <w:r>
-        <w:rPr>
-          <w:rFonts w:ascii="Arial" w:hAnsi="Arial"/>
-          <w:color w:val="0066CC"/>
-          <w:sz w:val="18"/>
-        </w:rPr>
-        <w:t>CARGOS Y HONORARIOS ADICIONALES: El Comprador acepta pagar los cargos y honorarios adicionales relacionados con el registro de un Memorando de este Contrato de Compraventa con Escritura Diferida y los costos administrativos del Vendedor.</w:t>
-      </w:r>
-    </w:p>
-    <w:p>
-      <w:pPr>
         <w:pStyle w:val="t1"/>
         <w:numPr>
           <w:ilvl w:val="1"/>
@@ -1941,20 +1913,6 @@
           <w:szCs w:val="28"/>
         </w:rPr>
         <w:t xml:space="preserve">Purchaser Will Pay the following options, if they apply: </w:t>
-      </w:r>
-    </w:p>
-    <w:p>
-      <w:pPr>
-        <w:pStyle w:val="SpanishTranslationDraft"/>
-        <w:ind w:left="259"/>
-      </w:pPr>
-      <w:r>
-        <w:rPr>
-          <w:rFonts w:ascii="Arial" w:hAnsi="Arial"/>
-          <w:color w:val="0066CC"/>
-          <w:sz w:val="18"/>
-        </w:rPr>
-        <w:t>El Comprador pagara las siguientes opciones, si corresponden:</w:t>
       </w:r>
     </w:p>
     <w:p>
@@ -2019,20 +1977,6 @@
     </w:p>
     <w:p>
       <w:pPr>
-        <w:pStyle w:val="SpanishTranslationDraft"/>
-        <w:ind w:left="2059"/>
-      </w:pPr>
-      <w:r>
-        <w:rPr>
-          <w:rFonts w:ascii="Arial" w:hAnsi="Arial"/>
-          <w:color w:val="0066CC"/>
-          <w:sz w:val="18"/>
-        </w:rPr>
-        <w:t>[X] Tasacion   [X] Levantamiento topografico</w:t>
-      </w:r>
-    </w:p>
-    <w:p>
-      <w:pPr>
         <w:pStyle w:val="t1"/>
         <w:tabs>
           <w:tab w:val="left" w:pos="360"/>
@@ -2119,20 +2063,6 @@
     </w:p>
     <w:p>
       <w:pPr>
-        <w:pStyle w:val="SpanishTranslationDraft"/>
-        <w:ind w:left="2059"/>
-      </w:pPr>
-      <w:r>
-        <w:rPr>
-          <w:rFonts w:ascii="Arial" w:hAnsi="Arial"/>
-          <w:color w:val="0066CC"/>
-          <w:sz w:val="18"/>
-        </w:rPr>
-        <w:t>[X] Informe de organismos destructores de madera   [X] Honorarios de corretaje inmobiliario</w:t>
-      </w:r>
-    </w:p>
-    <w:p>
-      <w:pPr>
         <w:pStyle w:val="t1"/>
         <w:tabs>
           <w:tab w:val="left" w:pos="360"/>
@@ -2164,20 +2094,6 @@
     </w:p>
     <w:p>
       <w:pPr>
-        <w:pStyle w:val="SpanishTranslationDraft"/>
-        <w:ind w:left="2059"/>
-      </w:pPr>
-      <w:r>
-        <w:rPr>
-          <w:rFonts w:ascii="Arial" w:hAnsi="Arial"/>
-          <w:color w:val="0066CC"/>
-          <w:sz w:val="18"/>
-        </w:rPr>
-        <w:t>[X] Impuesto de transferencia</w:t>
-      </w:r>
-    </w:p>
-    <w:p>
-      <w:pPr>
         <w:pStyle w:val="t1"/>
         <w:tabs>
           <w:tab w:val="left" w:pos="360"/>
@@ -2221,20 +2137,6 @@
     </w:p>
     <w:p>
       <w:pPr>
-        <w:pStyle w:val="SpanishTranslationDraft"/>
-        <w:ind w:left="2059"/>
-      </w:pPr>
-      <w:r>
-        <w:rPr>
-          <w:rFonts w:ascii="Arial" w:hAnsi="Arial"/>
-          <w:color w:val="0066CC"/>
-          <w:sz w:val="18"/>
-        </w:rPr>
-        <w:t>[   ] Otro______________________________________</w:t>
-      </w:r>
-    </w:p>
-    <w:p>
-      <w:pPr>
         <w:pStyle w:val="t1"/>
         <w:numPr>
           <w:ilvl w:val="1"/>
@@ -2266,20 +2168,6 @@
     </w:p>
     <w:p>
       <w:pPr>
-        <w:pStyle w:val="SpanishTranslationDraft"/>
-        <w:ind w:left="259"/>
-      </w:pPr>
-      <w:r>
-        <w:rPr>
-          <w:rFonts w:ascii="Arial" w:hAnsi="Arial"/>
-          <w:color w:val="0066CC"/>
-          <w:sz w:val="18"/>
-        </w:rPr>
-        <w:t>El Vendedor pagara:</w:t>
-      </w:r>
-    </w:p>
-    <w:p>
-      <w:pPr>
         <w:pStyle w:val="p10"/>
         <w:tabs>
           <w:tab w:val="left" w:pos="1800"/>
@@ -2314,20 +2202,6 @@
     </w:p>
     <w:p>
       <w:pPr>
-        <w:pStyle w:val="SpanishTranslationDraft"/>
-        <w:ind w:left="2059"/>
-      </w:pPr>
-      <w:r>
-        <w:rPr>
-          <w:rFonts w:ascii="Arial" w:hAnsi="Arial"/>
-          <w:color w:val="0066CC"/>
-          <w:sz w:val="18"/>
-        </w:rPr>
-        <w:t>[X] Costos de cierre</w:t>
-      </w:r>
-    </w:p>
-    <w:p>
-      <w:pPr>
         <w:pStyle w:val="p10"/>
         <w:tabs>
           <w:tab w:val="left" w:pos="1800"/>
@@ -2380,20 +2254,6 @@
     </w:p>
     <w:p>
       <w:pPr>
-        <w:pStyle w:val="SpanishTranslationDraft"/>
-        <w:ind w:left="2059"/>
-      </w:pPr>
-      <w:r>
-        <w:rPr>
-          <w:rFonts w:ascii="Arial" w:hAnsi="Arial"/>
-          <w:color w:val="0066CC"/>
-          <w:sz w:val="18"/>
-        </w:rPr>
-        <w:t>[X] Poliza de seguro de titulo   [X] Honorarios de abogado</w:t>
-      </w:r>
-    </w:p>
-    <w:p>
-      <w:pPr>
         <w:pStyle w:val="p10"/>
         <w:tabs>
           <w:tab w:val="left" w:pos="1800"/>
@@ -2446,20 +2306,6 @@
     </w:p>
     <w:p>
       <w:pPr>
-        <w:pStyle w:val="SpanishTranslationDraft"/>
-        <w:ind w:left="2059"/>
-      </w:pPr>
-      <w:r>
-        <w:rPr>
-          <w:rFonts w:ascii="Arial" w:hAnsi="Arial"/>
-          <w:color w:val="0066CC"/>
-          <w:sz w:val="18"/>
-        </w:rPr>
-        <w:t>[X] Costos de cierre   [X] Gastos de registro</w:t>
-      </w:r>
-    </w:p>
-    <w:p>
-      <w:pPr>
         <w:pStyle w:val="p10"/>
         <w:tabs>
           <w:tab w:val="left" w:pos="1800"/>
@@ -2512,20 +2358,6 @@
     </w:p>
     <w:p>
       <w:pPr>
-        <w:pStyle w:val="SpanishTranslationDraft"/>
-        <w:ind w:left="2059"/>
-      </w:pPr>
-      <w:r>
-        <w:rPr>
-          <w:rFonts w:ascii="Arial" w:hAnsi="Arial"/>
-          <w:color w:val="0066CC"/>
-          <w:sz w:val="18"/>
-        </w:rPr>
-        <w:t>[X] Timbres del pagare   [X] Impuesto intangible</w:t>
-      </w:r>
-    </w:p>
-    <w:p>
-      <w:pPr>
         <w:pStyle w:val="p10"/>
         <w:tabs>
           <w:tab w:val="left" w:pos="1800"/>
@@ -2549,20 +2381,6 @@
     </w:p>
     <w:p>
       <w:pPr>
-        <w:pStyle w:val="SpanishTranslationDraft"/>
-        <w:ind w:left="2059"/>
-      </w:pPr>
-      <w:r>
-        <w:rPr>
-          <w:rFonts w:ascii="Arial" w:hAnsi="Arial"/>
-          <w:color w:val="0066CC"/>
-          <w:sz w:val="18"/>
-        </w:rPr>
-        <w:t>[X] Cancelacion y gastos de registro</w:t>
-      </w:r>
-    </w:p>
-    <w:p>
-      <w:pPr>
         <w:pStyle w:val="p10"/>
         <w:tabs>
           <w:tab w:val="left" w:pos="1800"/>
@@ -2619,20 +2437,6 @@
     </w:p>
     <w:p>
       <w:pPr>
-        <w:pStyle w:val="SpanishTranslationDraft"/>
-        <w:ind w:left="2059"/>
-      </w:pPr>
-      <w:r>
-        <w:rPr>
-          <w:rFonts w:ascii="Arial" w:hAnsi="Arial"/>
-          <w:color w:val="0066CC"/>
-          <w:sz w:val="18"/>
-        </w:rPr>
-        <w:t>[   ] Informes de credito   [   ] Cargo de originacion del prestamo</w:t>
-      </w:r>
-    </w:p>
-    <w:p>
-      <w:pPr>
         <w:pStyle w:val="p10"/>
         <w:tabs>
           <w:tab w:val="left" w:pos="1800"/>
@@ -2689,20 +2493,6 @@
     </w:p>
     <w:p>
       <w:pPr>
-        <w:pStyle w:val="SpanishTranslationDraft"/>
-        <w:ind w:left="2059"/>
-      </w:pPr>
-      <w:r>
-        <w:rPr>
-          <w:rFonts w:ascii="Arial" w:hAnsi="Arial"/>
-          <w:color w:val="0066CC"/>
-          <w:sz w:val="18"/>
-        </w:rPr>
-        <w:t>[   ] Prima de seguro del prestamo   [   ] Otro_________________________________</w:t>
-      </w:r>
-    </w:p>
-    <w:p>
-      <w:pPr>
         <w:pStyle w:val="p10"/>
         <w:tabs>
           <w:tab w:val="left" w:pos="1800"/>
@@ -2732,20 +2522,6 @@
     </w:p>
     <w:p>
       <w:pPr>
-        <w:pStyle w:val="SpanishTranslationDraft"/>
-        <w:ind w:left="2059"/>
-      </w:pPr>
-      <w:r>
-        <w:rPr>
-          <w:rFonts w:ascii="Arial" w:hAnsi="Arial"/>
-          <w:color w:val="0066CC"/>
-          <w:sz w:val="18"/>
-        </w:rPr>
-        <w:t>[  ] Todos los demas cargos requeridos por el prestamista que la ley o regulacion prohibe que pague el Comprador.</w:t>
-      </w:r>
-    </w:p>
-    <w:p>
-      <w:pPr>
         <w:pStyle w:val="p13"/>
         <w:spacing w:line="264" w:lineRule="auto"/>
         <w:ind w:left="1800" w:firstLine="0"/>
@@ -2772,20 +2548,6 @@
           <w:szCs w:val="28"/>
         </w:rPr>
         <w:t xml:space="preserve"> Repairs or replacements, in addition to those in paragraph 9, not to exceed $_________________________</w:t>
-      </w:r>
-    </w:p>
-    <w:p>
-      <w:pPr>
-        <w:pStyle w:val="SpanishTranslationDraft"/>
-        <w:ind w:left="2059"/>
-      </w:pPr>
-      <w:r>
-        <w:rPr>
-          <w:rFonts w:ascii="Arial" w:hAnsi="Arial"/>
-          <w:color w:val="0066CC"/>
-          <w:sz w:val="18"/>
-        </w:rPr>
-        <w:t>[   ] Reparaciones o reemplazos, ademas de los indicados en el parrafo 9, que no excedan de $_________________________</w:t>
       </w:r>
     </w:p>
     <w:p>
@@ -2823,20 +2585,6 @@
         </w:rPr>
         <w:lastRenderedPageBreak/>
         <w:t>current at Seller's expense at the time of closing.</w:t>
-      </w:r>
-    </w:p>
-    <w:p>
-      <w:pPr>
-        <w:pStyle w:val="SpanishTranslationDraft"/>
-        <w:ind w:left="2059"/>
-      </w:pPr>
-      <w:r>
-        <w:rPr>
-          <w:rFonts w:ascii="Arial" w:hAnsi="Arial"/>
-          <w:color w:val="0066CC"/>
-          <w:sz w:val="18"/>
-        </w:rPr>
-        <w:t>[   ] Todos los pagos hipotecarios o cuotas de condominio y asociacion estaran al dia por cuenta del Vendedor al momento del cierre.</w:t>
       </w:r>
     </w:p>
     <w:p>

</xml_diff>